<commit_message>
docs: finalize monochrome submission PDF and clean repository structure
</commit_message>
<xml_diff>
--- a/Registration_Microservice_Docker_EC2_Activity.docx
+++ b/Registration_Microservice_Docker_EC2_Activity.docx
@@ -4,41 +4,42 @@
   <w:body>
     <w:p>
       <w:pPr>
-        <w:spacing w:after="80"/>
+        <w:spacing w:before="0" w:after="80"/>
       </w:pPr>
       <w:r>
         <w:rPr>
           <w:b/>
-          <w:color w:val="1E3A8A"/>
-          <w:sz w:val="44"/>
+          <w:color w:val="000000"/>
+          <w:sz w:val="40"/>
         </w:rPr>
-        <w:t>Activity Report: Dockerizing Registration Microservice &amp; AWS EC2 Cloud Deployment</w:t>
+        <w:t>Activity Report: Registration Microservice Dockerization &amp; AWS EC2 Cloud Deployment</w:t>
       </w:r>
     </w:p>
     <w:p>
       <w:pPr>
-        <w:spacing w:after="320"/>
+        <w:spacing w:after="280"/>
       </w:pPr>
       <w:r>
         <w:rPr>
-          <w:i/>
-          <w:color w:val="64748B"/>
-          <w:sz w:val="22"/>
+          <w:color w:val="323232"/>
+          <w:sz w:val="21"/>
         </w:rPr>
-        <w:t>Student Name: Sokhadom Khorn  |  Platform: AWS &amp; Docker Hub (sokhadum)</w:t>
+        <w:t>Student Name: Sokhadom Khorn  |  Student ID: 2023517</w:t>
         <w:br/>
-        <w:t>Assignment: Cloud Microservices Containerization &amp; Deployment  |  Score: 25 / 25 Points</w:t>
+        <w:t>Platform: Docker Hub (sokhadum) &amp; AWS Cloud (us-east-1)</w:t>
+        <w:br/>
+        <w:t>Course: Cloud Computing &amp; Microservices Architecture</w:t>
       </w:r>
     </w:p>
     <w:p>
       <w:pPr>
-        <w:spacing w:after="240"/>
+        <w:spacing w:after="280"/>
       </w:pPr>
       <w:r>
         <w:rPr>
-          <w:color w:val="CBD5E1"/>
+          <w:color w:val="787878"/>
         </w:rPr>
-        <w:t>――――――――――――――――――――――――――――――――――――――――――――――――――――――――――</w:t>
+        <w:t>――――――――――――――――――――――――――――――――――――――――――――――――――――――――――――</w:t>
       </w:r>
     </w:p>
     <w:p>
@@ -48,9 +49,10 @@
       </w:pPr>
       <w:r>
         <w:rPr>
-          <w:color w:val="1E3A8A"/>
+          <w:b/>
+          <w:color w:val="000000"/>
         </w:rPr>
-        <w:t>Activity 1: Registration Microservice Architecture &amp; Prerequisites</w:t>
+        <w:t>Activity 1: Registration Microservice Setup &amp; Architecture</w:t>
       </w:r>
     </w:p>
     <w:p>
@@ -58,7 +60,10 @@
         <w:spacing w:after="80" w:line="276" w:lineRule="auto"/>
       </w:pPr>
       <w:r>
-        <w:t>The previously developed Registration Microservice was taken from the repository. It is implemented in Node.js and Express, connecting to a MongoDB database to securely store user credentials hashed with bcryptjs. The microservice operates on port 5001.</w:t>
+        <w:rPr>
+          <w:color w:val="000000"/>
+        </w:rPr>
+        <w:t>The previously implemented Registration Microservice was prepared from the repository. It is structured in Node.js and Express, connecting to a MongoDB database to securely register user accounts with bcryptjs password hashing. The microservice listens on port 5001.</w:t>
       </w:r>
     </w:p>
     <w:p>
@@ -67,16 +72,16 @@
       </w:pPr>
       <w:r>
         <w:rPr>
-          <w:color w:val="475569"/>
+          <w:color w:val="464646"/>
           <w:sz w:val="19"/>
         </w:rPr>
-        <w:t>• Directory: /Registration_Microservice</w:t>
-        <w:br/>
-        <w:t>• Key files: index.js, db.js, package.json, models/User.js</w:t>
+        <w:t>• Service Directory: /Registration_Microservice</w:t>
         <w:br/>
         <w:t>• Port: 5001</w:t>
         <w:br/>
         <w:t>• Database: university_identity_db</w:t>
+        <w:br/>
+        <w:t>• Key Libraries: express, mongoose, bcryptjs, cors, dotenv</w:t>
       </w:r>
     </w:p>
     <w:p>
@@ -86,7 +91,8 @@
       </w:pPr>
       <w:r>
         <w:rPr>
-          <w:color w:val="1E3A8A"/>
+          <w:b/>
+          <w:color w:val="000000"/>
         </w:rPr>
         <w:t>Activity 2: Create Dockerfile and Add Code Inside Registration Microservice Folder</w:t>
       </w:r>
@@ -96,7 +102,10 @@
         <w:spacing w:after="80" w:line="276" w:lineRule="auto"/>
       </w:pPr>
       <w:r>
-        <w:t>A production-grade Dockerfile was authored inside the 'Registration_Microservice' folder using the lightweight node:18-alpine base image. A multi-step preparation copies package manifests, installs production dependencies, bundles application files, configures an automated container healthcheck on port 5001, and defines the default execution entrypoint.</w:t>
+        <w:rPr>
+          <w:color w:val="000000"/>
+        </w:rPr>
+        <w:t>A production-grade Dockerfile was created directly inside the 'Registration_Microservice' folder. It utilizes the lightweight 'node:18-alpine' base image, copies package manifests, installs production dependencies, exposes port 5001, configures an automated container healthcheck, and specifies 'node index.js' as the startup command.</w:t>
       </w:r>
     </w:p>
     <w:p>
@@ -105,22 +114,22 @@
       </w:pPr>
       <w:r>
         <w:rPr>
-          <w:color w:val="475569"/>
+          <w:color w:val="464646"/>
           <w:sz w:val="19"/>
         </w:rPr>
-        <w:t>Screenshot shows the Dockerfile code opened directly inside the Registration_Microservice folder.</w:t>
+        <w:t>Screenshot: Dockerfile Code opened inside the Registration_Microservice folder.</w:t>
       </w:r>
     </w:p>
     <w:p>
       <w:pPr>
         <w:keepNext/>
-        <w:spacing w:after="200"/>
+        <w:spacing w:before="120" w:after="60"/>
         <w:jc w:val="center"/>
       </w:pPr>
       <w:r>
         <w:drawing>
           <wp:inline xmlns:a="http://schemas.openxmlformats.org/drawingml/2006/main" xmlns:pic="http://schemas.openxmlformats.org/drawingml/2006/picture">
-            <wp:extent cx="5760720" cy="3906816"/>
+            <wp:extent cx="5669280" cy="3119631"/>
             <wp:docPr id="1" name="Picture 1"/>
             <wp:cNvGraphicFramePr>
               <a:graphicFrameLocks noChangeAspect="1"/>
@@ -129,7 +138,7 @@
               <a:graphicData uri="http://schemas.openxmlformats.org/drawingml/2006/picture">
                 <pic:pic>
                   <pic:nvPicPr>
-                    <pic:cNvPr id="0" name="01_dockerfile_code.png"/>
+                    <pic:cNvPr id="0" name="Screenshot 2026-09-22 162323.png"/>
                     <pic:cNvPicPr/>
                   </pic:nvPicPr>
                   <pic:blipFill>
@@ -141,7 +150,7 @@
                   <pic:spPr>
                     <a:xfrm>
                       <a:off x="0" y="0"/>
-                      <a:ext cx="5760720" cy="3906816"/>
+                      <a:ext cx="5669280" cy="3119631"/>
                     </a:xfrm>
                     <a:prstGeom prst="rect"/>
                   </pic:spPr>
@@ -154,36 +163,16 @@
     </w:p>
     <w:p>
       <w:pPr>
-        <w:pStyle w:val="Heading2"/>
-        <w:spacing w:before="280" w:after="80"/>
+        <w:spacing w:after="240"/>
+        <w:jc w:val="center"/>
       </w:pPr>
       <w:r>
         <w:rPr>
-          <w:color w:val="1E3A8A"/>
+          <w:i/>
+          <w:color w:val="282828"/>
+          <w:sz w:val="18"/>
         </w:rPr>
-        <w:t>Activity 3: Start Docker Desktop &amp; Verify Daemon Engine</w:t>
-      </w:r>
-    </w:p>
-    <w:p>
-      <w:pPr>
-        <w:spacing w:after="80" w:line="276" w:lineRule="auto"/>
-      </w:pPr>
-      <w:r>
-        <w:t>Docker Desktop was initialized on the host machine. The Docker engine backend and WSL Linux subsystems were booted to operational status, ready to accept container management and image build instructions.</w:t>
-      </w:r>
-    </w:p>
-    <w:p>
-      <w:pPr>
-        <w:spacing w:after="160"/>
-      </w:pPr>
-      <w:r>
-        <w:rPr>
-          <w:color w:val="475569"/>
-          <w:sz w:val="19"/>
-        </w:rPr>
-        <w:t>• Engine: Docker Desktop 28.2.2 (desktop-linux)</w:t>
-        <w:br/>
-        <w:t>• Daemon state: Active &amp; Listening on \\.\pipe\dockerDesktopLinuxEngine</w:t>
+        <w:t>Figure 2.1: Dockerfile Code inside Registration_Microservice Folder</w:t>
       </w:r>
     </w:p>
     <w:p>
@@ -193,9 +182,10 @@
       </w:pPr>
       <w:r>
         <w:rPr>
-          <w:color w:val="1E3A8A"/>
+          <w:b/>
+          <w:color w:val="000000"/>
         </w:rPr>
-        <w:t>Activity 4: Create Image with Proper Image Name Convention</w:t>
+        <w:t>Activity 3: Start Docker Desktop &amp; Authenticate CLI</w:t>
       </w:r>
     </w:p>
     <w:p>
@@ -203,7 +193,10 @@
         <w:spacing w:after="80" w:line="276" w:lineRule="auto"/>
       </w:pPr>
       <w:r>
-        <w:t>The Docker image was built following standard naming conventions: '&lt;dockerhub_username&gt;/&lt;repository_name&gt;:&lt;tag&gt;'. Using the student's Docker Hub handle 'sokhadum', the image was tagged as 'sokhadum/registration-microservice:latest' and 'v1.0'.</w:t>
+        <w:rPr>
+          <w:color w:val="000000"/>
+        </w:rPr>
+        <w:t>Docker Desktop was launched and initialized on the local machine. Authentication to Docker Hub was established via Personal Access Token (PAT) for user 'sokhadum', confirming CLI readiness for building and publishing.</w:t>
       </w:r>
     </w:p>
     <w:p>
@@ -212,22 +205,22 @@
       </w:pPr>
       <w:r>
         <w:rPr>
-          <w:color w:val="475569"/>
+          <w:color w:val="464646"/>
           <w:sz w:val="19"/>
         </w:rPr>
-        <w:t>Command line instruction executed: docker build -t sokhadum/registration-microservice:latest .</w:t>
+        <w:t>Screenshot: Docker CLI login success for user 'sokhadum'.</w:t>
       </w:r>
     </w:p>
     <w:p>
       <w:pPr>
         <w:keepNext/>
-        <w:spacing w:after="200"/>
+        <w:spacing w:before="120" w:after="60"/>
         <w:jc w:val="center"/>
       </w:pPr>
       <w:r>
         <w:drawing>
           <wp:inline xmlns:a="http://schemas.openxmlformats.org/drawingml/2006/main" xmlns:pic="http://schemas.openxmlformats.org/drawingml/2006/picture">
-            <wp:extent cx="5760720" cy="2272866"/>
+            <wp:extent cx="5669280" cy="2044086"/>
             <wp:docPr id="2" name="Picture 2"/>
             <wp:cNvGraphicFramePr>
               <a:graphicFrameLocks noChangeAspect="1"/>
@@ -236,7 +229,7 @@
               <a:graphicData uri="http://schemas.openxmlformats.org/drawingml/2006/picture">
                 <pic:pic>
                   <pic:nvPicPr>
-                    <pic:cNvPr id="0" name="02_docker_build_command.png"/>
+                    <pic:cNvPr id="0" name="Screenshot 2026-09-22 162329.png"/>
                     <pic:cNvPicPr/>
                   </pic:nvPicPr>
                   <pic:blipFill>
@@ -248,7 +241,7 @@
                   <pic:spPr>
                     <a:xfrm>
                       <a:off x="0" y="0"/>
-                      <a:ext cx="5760720" cy="2272866"/>
+                      <a:ext cx="5669280" cy="2044086"/>
                     </a:xfrm>
                     <a:prstGeom prst="rect"/>
                   </pic:spPr>
@@ -261,14 +254,29 @@
     </w:p>
     <w:p>
       <w:pPr>
+        <w:spacing w:after="240"/>
+        <w:jc w:val="center"/>
+      </w:pPr>
+      <w:r>
+        <w:rPr>
+          <w:i/>
+          <w:color w:val="282828"/>
+          <w:sz w:val="18"/>
+        </w:rPr>
+        <w:t>Figure 3.1: Docker Login Command &amp; Authentication Success</w:t>
+      </w:r>
+    </w:p>
+    <w:p>
+      <w:pPr>
         <w:pStyle w:val="Heading2"/>
         <w:spacing w:before="280" w:after="80"/>
       </w:pPr>
       <w:r>
         <w:rPr>
-          <w:color w:val="1E3A8A"/>
+          <w:b/>
+          <w:color w:val="000000"/>
         </w:rPr>
-        <w:t>Activity 5: Check Image is Created or Not</w:t>
+        <w:t>Activity 4: Create Image with Proper Image Name Convention</w:t>
       </w:r>
     </w:p>
     <w:p>
@@ -276,7 +284,10 @@
         <w:spacing w:after="80" w:line="276" w:lineRule="auto"/>
       </w:pPr>
       <w:r>
-        <w:t>The local Docker image cache was queried using 'docker images'. The output confirms that 'sokhadum/registration-microservice:latest' with Image ID 9182546e7a09 was compiled with a compact size of 236MB.</w:t>
+        <w:rPr>
+          <w:color w:val="000000"/>
+        </w:rPr>
+        <w:t>The Docker image was created using standard Docker Hub naming convention: '&lt;username&gt;/&lt;image_name&gt;:&lt;tag&gt;'. The command was executed inside the Registration_Microservice folder, successfully compiling the image layers.</w:t>
       </w:r>
     </w:p>
     <w:p>
@@ -285,22 +296,22 @@
       </w:pPr>
       <w:r>
         <w:rPr>
-          <w:color w:val="475569"/>
+          <w:color w:val="464646"/>
           <w:sz w:val="19"/>
         </w:rPr>
-        <w:t>Command line executed: docker images sokhadum/registration-microservice</w:t>
+        <w:t>Command: docker build -t sokhadum/registration-microservice:latest .</w:t>
       </w:r>
     </w:p>
     <w:p>
       <w:pPr>
         <w:keepNext/>
-        <w:spacing w:after="200"/>
+        <w:spacing w:before="120" w:after="60"/>
         <w:jc w:val="center"/>
       </w:pPr>
       <w:r>
         <w:drawing>
           <wp:inline xmlns:a="http://schemas.openxmlformats.org/drawingml/2006/main" xmlns:pic="http://schemas.openxmlformats.org/drawingml/2006/picture">
-            <wp:extent cx="5760720" cy="1990067"/>
+            <wp:extent cx="5669280" cy="1765008"/>
             <wp:docPr id="3" name="Picture 3"/>
             <wp:cNvGraphicFramePr>
               <a:graphicFrameLocks noChangeAspect="1"/>
@@ -309,7 +320,7 @@
               <a:graphicData uri="http://schemas.openxmlformats.org/drawingml/2006/picture">
                 <pic:pic>
                   <pic:nvPicPr>
-                    <pic:cNvPr id="0" name="03_docker_images_check.png"/>
+                    <pic:cNvPr id="0" name="Screenshot 2026-09-22 175948.png"/>
                     <pic:cNvPicPr/>
                   </pic:nvPicPr>
                   <pic:blipFill>
@@ -321,7 +332,7 @@
                   <pic:spPr>
                     <a:xfrm>
                       <a:off x="0" y="0"/>
-                      <a:ext cx="5760720" cy="1990067"/>
+                      <a:ext cx="5669280" cy="1765008"/>
                     </a:xfrm>
                     <a:prstGeom prst="rect"/>
                   </pic:spPr>
@@ -334,14 +345,29 @@
     </w:p>
     <w:p>
       <w:pPr>
+        <w:spacing w:after="240"/>
+        <w:jc w:val="center"/>
+      </w:pPr>
+      <w:r>
+        <w:rPr>
+          <w:i/>
+          <w:color w:val="282828"/>
+          <w:sz w:val="18"/>
+        </w:rPr>
+        <w:t>Figure 4.1: Command Line Instruction &amp; Output for Docker Build</w:t>
+      </w:r>
+    </w:p>
+    <w:p>
+      <w:pPr>
         <w:pStyle w:val="Heading2"/>
         <w:spacing w:before="280" w:after="80"/>
       </w:pPr>
       <w:r>
         <w:rPr>
-          <w:color w:val="1E3A8A"/>
+          <w:b/>
+          <w:color w:val="000000"/>
         </w:rPr>
-        <w:t>Activity 6: Run Docker Image Locally &amp; Verify Registration API via Postman</w:t>
+        <w:t>Activity 5: Check Image is Created or Not</w:t>
       </w:r>
     </w:p>
     <w:p>
@@ -349,7 +375,10 @@
         <w:spacing w:after="80" w:line="276" w:lineRule="auto"/>
       </w:pPr>
       <w:r>
-        <w:t>The Docker image was deployed locally alongside a MongoDB container on an isolated bridge network ('app-network'). The Registration API was then called via Postman with sample student registration data. The service processed the payload, hashed the password, saved the record to MongoDB, and responded with HTTP 201 Created.</w:t>
+        <w:rPr>
+          <w:color w:val="000000"/>
+        </w:rPr>
+        <w:t>The local Docker image repository was inspected using 'docker images'. The image 'sokhadum/registration-microservice' with tag 'latest' is confirmed present with Image ID 9182546e7a09 (236MB).</w:t>
       </w:r>
     </w:p>
     <w:p>
@@ -358,24 +387,22 @@
       </w:pPr>
       <w:r>
         <w:rPr>
-          <w:color w:val="475569"/>
+          <w:color w:val="464646"/>
           <w:sz w:val="19"/>
         </w:rPr>
-        <w:t>• Command line: docker run -d --name registration-service -p 5001:5001 --network app-network ...</w:t>
-        <w:br/>
-        <w:t>• Postman Test: POST http://localhost:5001/register/userregister -&gt; HTTP 201 Created</w:t>
+        <w:t>Command: docker images sokhadum/registration-microservice</w:t>
       </w:r>
     </w:p>
     <w:p>
       <w:pPr>
         <w:keepNext/>
-        <w:spacing w:after="200"/>
+        <w:spacing w:before="120" w:after="60"/>
         <w:jc w:val="center"/>
       </w:pPr>
       <w:r>
         <w:drawing>
           <wp:inline xmlns:a="http://schemas.openxmlformats.org/drawingml/2006/main" xmlns:pic="http://schemas.openxmlformats.org/drawingml/2006/picture">
-            <wp:extent cx="5760720" cy="2147177"/>
+            <wp:extent cx="5669280" cy="1958479"/>
             <wp:docPr id="4" name="Picture 4"/>
             <wp:cNvGraphicFramePr>
               <a:graphicFrameLocks noChangeAspect="1"/>
@@ -384,7 +411,7 @@
               <a:graphicData uri="http://schemas.openxmlformats.org/drawingml/2006/picture">
                 <pic:pic>
                   <pic:nvPicPr>
-                    <pic:cNvPr id="0" name="04_local_docker_run.png"/>
+                    <pic:cNvPr id="0" name="03_docker_images_check.png"/>
                     <pic:cNvPicPr/>
                   </pic:nvPicPr>
                   <pic:blipFill>
@@ -396,7 +423,7 @@
                   <pic:spPr>
                     <a:xfrm>
                       <a:off x="0" y="0"/>
-                      <a:ext cx="5760720" cy="2147177"/>
+                      <a:ext cx="5669280" cy="1958479"/>
                     </a:xfrm>
                     <a:prstGeom prst="rect"/>
                   </pic:spPr>
@@ -409,14 +436,68 @@
     </w:p>
     <w:p>
       <w:pPr>
+        <w:spacing w:after="240"/>
+        <w:jc w:val="center"/>
+      </w:pPr>
+      <w:r>
+        <w:rPr>
+          <w:i/>
+          <w:color w:val="282828"/>
+          <w:sz w:val="18"/>
+        </w:rPr>
+        <w:t>Figure 5.1: Verification of Created Image in Local Docker Registry</w:t>
+      </w:r>
+    </w:p>
+    <w:p>
+      <w:pPr>
+        <w:pStyle w:val="Heading2"/>
+        <w:spacing w:before="280" w:after="80"/>
+      </w:pPr>
+      <w:r>
+        <w:rPr>
+          <w:b/>
+          <w:color w:val="000000"/>
+        </w:rPr>
+        <w:t>Activity 6: Run Docker Image Locally &amp; Verify Registration API via Postman</w:t>
+      </w:r>
+    </w:p>
+    <w:p>
+      <w:pPr>
+        <w:spacing w:after="80" w:line="276" w:lineRule="auto"/>
+      </w:pPr>
+      <w:r>
+        <w:rPr>
+          <w:color w:val="000000"/>
+        </w:rPr>
+        <w:t>The Docker image was executed locally on port 5001 connected to a MongoDB container on bridge network 'app-network'. The registration endpoint was tested via Postman with sample student registration payload, returning HTTP 201 Created. The service health endpoint was also verified returning HTTP 200 OK.</w:t>
+      </w:r>
+    </w:p>
+    <w:p>
+      <w:pPr>
+        <w:spacing w:after="160"/>
+      </w:pPr>
+      <w:r>
+        <w:rPr>
+          <w:color w:val="464646"/>
+          <w:sz w:val="19"/>
+        </w:rPr>
+        <w:t>• Local Run: docker run -d --name registration-service -p 5001:5001 ...</w:t>
+        <w:br/>
+        <w:t>• Postman Registration: POST http://localhost:5001/register/userregister -&gt; 201 Created</w:t>
+        <w:br/>
+        <w:t>• Postman Health Check: GET http://localhost:5001/health -&gt; 200 OK</w:t>
+      </w:r>
+    </w:p>
+    <w:p>
+      <w:pPr>
         <w:keepNext/>
-        <w:spacing w:after="200"/>
+        <w:spacing w:before="120" w:after="60"/>
         <w:jc w:val="center"/>
       </w:pPr>
       <w:r>
         <w:drawing>
           <wp:inline xmlns:a="http://schemas.openxmlformats.org/drawingml/2006/main" xmlns:pic="http://schemas.openxmlformats.org/drawingml/2006/picture">
-            <wp:extent cx="5760720" cy="2932730"/>
+            <wp:extent cx="5669280" cy="2113095"/>
             <wp:docPr id="5" name="Picture 5"/>
             <wp:cNvGraphicFramePr>
               <a:graphicFrameLocks noChangeAspect="1"/>
@@ -425,7 +506,7 @@
               <a:graphicData uri="http://schemas.openxmlformats.org/drawingml/2006/picture">
                 <pic:pic>
                   <pic:nvPicPr>
-                    <pic:cNvPr id="0" name="05_local_postman_test.png"/>
+                    <pic:cNvPr id="0" name="04_local_docker_run.png"/>
                     <pic:cNvPicPr/>
                   </pic:nvPicPr>
                   <pic:blipFill>
@@ -437,7 +518,7 @@
                   <pic:spPr>
                     <a:xfrm>
                       <a:off x="0" y="0"/>
-                      <a:ext cx="5760720" cy="2932730"/>
+                      <a:ext cx="5669280" cy="2113095"/>
                     </a:xfrm>
                     <a:prstGeom prst="rect"/>
                   </pic:spPr>
@@ -450,46 +531,28 @@
     </w:p>
     <w:p>
       <w:pPr>
-        <w:pStyle w:val="Heading2"/>
-        <w:spacing w:before="280" w:after="80"/>
+        <w:spacing w:after="240"/>
+        <w:jc w:val="center"/>
       </w:pPr>
       <w:r>
         <w:rPr>
-          <w:color w:val="1E3A8A"/>
+          <w:i/>
+          <w:color w:val="282828"/>
+          <w:sz w:val="18"/>
         </w:rPr>
-        <w:t>Activity 7: Push Image to Docker Hub Repository</w:t>
-      </w:r>
-    </w:p>
-    <w:p>
-      <w:pPr>
-        <w:spacing w:after="80" w:line="276" w:lineRule="auto"/>
-      </w:pPr>
-      <w:r>
-        <w:t>Authentication was established with Docker Hub using a Personal Access Token (PAT) with Read/Write privileges for username 'sokhadum'. Both 'latest' and 'v1.0' tags were pushed to the public Docker Hub registry, making the container image globally pullable.</w:t>
-      </w:r>
-    </w:p>
-    <w:p>
-      <w:pPr>
-        <w:spacing w:after="160"/>
-      </w:pPr>
-      <w:r>
-        <w:rPr>
-          <w:color w:val="475569"/>
-          <w:sz w:val="19"/>
-        </w:rPr>
-        <w:t>Command line executed: docker push sokhadum/registration-microservice:latest</w:t>
+        <w:t>Figure 6.1: Running Container &amp; Local Docker Status</w:t>
       </w:r>
     </w:p>
     <w:p>
       <w:pPr>
         <w:keepNext/>
-        <w:spacing w:after="200"/>
+        <w:spacing w:before="120" w:after="60"/>
         <w:jc w:val="center"/>
       </w:pPr>
       <w:r>
         <w:drawing>
           <wp:inline xmlns:a="http://schemas.openxmlformats.org/drawingml/2006/main" xmlns:pic="http://schemas.openxmlformats.org/drawingml/2006/picture">
-            <wp:extent cx="5760720" cy="2272866"/>
+            <wp:extent cx="5669280" cy="3926328"/>
             <wp:docPr id="6" name="Picture 6"/>
             <wp:cNvGraphicFramePr>
               <a:graphicFrameLocks noChangeAspect="1"/>
@@ -498,7 +561,7 @@
               <a:graphicData uri="http://schemas.openxmlformats.org/drawingml/2006/picture">
                 <pic:pic>
                   <pic:nvPicPr>
-                    <pic:cNvPr id="0" name="06_docker_push_command.png"/>
+                    <pic:cNvPr id="0" name="Screenshot 2026-09-22 180416.png"/>
                     <pic:cNvPicPr/>
                   </pic:nvPicPr>
                   <pic:blipFill>
@@ -510,7 +573,7 @@
                   <pic:spPr>
                     <a:xfrm>
                       <a:off x="0" y="0"/>
-                      <a:ext cx="5760720" cy="2272866"/>
+                      <a:ext cx="5669280" cy="3926328"/>
                     </a:xfrm>
                     <a:prstGeom prst="rect"/>
                   </pic:spPr>
@@ -523,12 +586,173 @@
     </w:p>
     <w:p>
       <w:pPr>
+        <w:spacing w:after="240"/>
+        <w:jc w:val="center"/>
+      </w:pPr>
+      <w:r>
+        <w:rPr>
+          <w:i/>
+          <w:color w:val="282828"/>
+          <w:sz w:val="18"/>
+        </w:rPr>
+        <w:t>Figure 6.2: Postman Local User Registration API Call (201 Created)</w:t>
+      </w:r>
+    </w:p>
+    <w:p>
+      <w:pPr>
+        <w:keepNext/>
+        <w:spacing w:before="120" w:after="60"/>
+        <w:jc w:val="center"/>
+      </w:pPr>
+      <w:r>
+        <w:drawing>
+          <wp:inline xmlns:a="http://schemas.openxmlformats.org/drawingml/2006/main" xmlns:pic="http://schemas.openxmlformats.org/drawingml/2006/picture">
+            <wp:extent cx="5669280" cy="3115631"/>
+            <wp:docPr id="7" name="Picture 7"/>
+            <wp:cNvGraphicFramePr>
+              <a:graphicFrameLocks noChangeAspect="1"/>
+            </wp:cNvGraphicFramePr>
+            <a:graphic>
+              <a:graphicData uri="http://schemas.openxmlformats.org/drawingml/2006/picture">
+                <pic:pic>
+                  <pic:nvPicPr>
+                    <pic:cNvPr id="0" name="Screenshot 2026-09-22 181026.png"/>
+                    <pic:cNvPicPr/>
+                  </pic:nvPicPr>
+                  <pic:blipFill>
+                    <a:blip r:embed="rId15"/>
+                    <a:stretch>
+                      <a:fillRect/>
+                    </a:stretch>
+                  </pic:blipFill>
+                  <pic:spPr>
+                    <a:xfrm>
+                      <a:off x="0" y="0"/>
+                      <a:ext cx="5669280" cy="3115631"/>
+                    </a:xfrm>
+                    <a:prstGeom prst="rect"/>
+                  </pic:spPr>
+                </pic:pic>
+              </a:graphicData>
+            </a:graphic>
+          </wp:inline>
+        </w:drawing>
+      </w:r>
+    </w:p>
+    <w:p>
+      <w:pPr>
+        <w:spacing w:after="240"/>
+        <w:jc w:val="center"/>
+      </w:pPr>
+      <w:r>
+        <w:rPr>
+          <w:i/>
+          <w:color w:val="282828"/>
+          <w:sz w:val="18"/>
+        </w:rPr>
+        <w:t>Figure 6.3: Postman Local Service Health Check (200 OK)</w:t>
+      </w:r>
+    </w:p>
+    <w:p>
+      <w:pPr>
         <w:pStyle w:val="Heading2"/>
         <w:spacing w:before="280" w:after="80"/>
       </w:pPr>
       <w:r>
         <w:rPr>
-          <w:color w:val="1E3A8A"/>
+          <w:b/>
+          <w:color w:val="000000"/>
+        </w:rPr>
+        <w:t>Activity 7: Push Image to Docker Hub Repository</w:t>
+      </w:r>
+    </w:p>
+    <w:p>
+      <w:pPr>
+        <w:spacing w:after="80" w:line="276" w:lineRule="auto"/>
+      </w:pPr>
+      <w:r>
+        <w:rPr>
+          <w:color w:val="000000"/>
+        </w:rPr>
+        <w:t>The built container image was pushed to the public Docker Hub registry under 'sokhadum/registration-microservice:latest'. All layers were pushed and verified with sha256 digest.</w:t>
+      </w:r>
+    </w:p>
+    <w:p>
+      <w:pPr>
+        <w:spacing w:after="160"/>
+      </w:pPr>
+      <w:r>
+        <w:rPr>
+          <w:color w:val="464646"/>
+          <w:sz w:val="19"/>
+        </w:rPr>
+        <w:t>Command: docker push sokhadum/registration-microservice:latest</w:t>
+      </w:r>
+    </w:p>
+    <w:p>
+      <w:pPr>
+        <w:keepNext/>
+        <w:spacing w:before="120" w:after="60"/>
+        <w:jc w:val="center"/>
+      </w:pPr>
+      <w:r>
+        <w:drawing>
+          <wp:inline xmlns:a="http://schemas.openxmlformats.org/drawingml/2006/main" xmlns:pic="http://schemas.openxmlformats.org/drawingml/2006/picture">
+            <wp:extent cx="5669280" cy="1278046"/>
+            <wp:docPr id="8" name="Picture 8"/>
+            <wp:cNvGraphicFramePr>
+              <a:graphicFrameLocks noChangeAspect="1"/>
+            </wp:cNvGraphicFramePr>
+            <a:graphic>
+              <a:graphicData uri="http://schemas.openxmlformats.org/drawingml/2006/picture">
+                <pic:pic>
+                  <pic:nvPicPr>
+                    <pic:cNvPr id="0" name="Screenshot 2026-09-22 180520.png"/>
+                    <pic:cNvPicPr/>
+                  </pic:nvPicPr>
+                  <pic:blipFill>
+                    <a:blip r:embed="rId16"/>
+                    <a:stretch>
+                      <a:fillRect/>
+                    </a:stretch>
+                  </pic:blipFill>
+                  <pic:spPr>
+                    <a:xfrm>
+                      <a:off x="0" y="0"/>
+                      <a:ext cx="5669280" cy="1278046"/>
+                    </a:xfrm>
+                    <a:prstGeom prst="rect"/>
+                  </pic:spPr>
+                </pic:pic>
+              </a:graphicData>
+            </a:graphic>
+          </wp:inline>
+        </w:drawing>
+      </w:r>
+    </w:p>
+    <w:p>
+      <w:pPr>
+        <w:spacing w:after="240"/>
+        <w:jc w:val="center"/>
+      </w:pPr>
+      <w:r>
+        <w:rPr>
+          <w:i/>
+          <w:color w:val="282828"/>
+          <w:sz w:val="18"/>
+        </w:rPr>
+        <w:t>Figure 7.1: Command Line Execution of Docker Hub Push</w:t>
+      </w:r>
+    </w:p>
+    <w:p>
+      <w:pPr>
+        <w:pStyle w:val="Heading2"/>
+        <w:spacing w:before="280" w:after="80"/>
+      </w:pPr>
+      <w:r>
+        <w:rPr>
+          <w:b/>
+          <w:color w:val="000000"/>
         </w:rPr>
         <w:t>Activity 8: Create EC2 Instance, Configure Security Group &amp; Install Docker</w:t>
       </w:r>
@@ -538,7 +762,10 @@
         <w:spacing w:after="80" w:line="276" w:lineRule="auto"/>
       </w:pPr>
       <w:r>
-        <w:t>An Amazon Linux 2023 EC2 instance (t2.micro) was launched in region us-east-1 using KeyPair 'vockey' (labsuser.pem). A custom Security Group ('registration-microservice-sg') was configured to permit inbound traffic on ports 22 (SSH), 5001 (Registration Microservice), and 27017 (MongoDB). Docker was installed and enabled as a systemd service.</w:t>
+        <w:rPr>
+          <w:color w:val="000000"/>
+        </w:rPr>
+        <w:t>An Amazon Linux 2023 EC2 instance (t2.micro) was provisioned in region us-east-1 using KeyPair 'vockey' (labsuser.pem). A Security Group ('registration-microservice-sg') was configured allowing inbound TCP on ports 22 (SSH), 5001 (Registration API), and 27017 (MongoDB). Docker was installed and enabled as a systemd service.</w:t>
       </w:r>
     </w:p>
     <w:p>
@@ -547,7 +774,7 @@
       </w:pPr>
       <w:r>
         <w:rPr>
-          <w:color w:val="475569"/>
+          <w:color w:val="464646"/>
           <w:sz w:val="19"/>
         </w:rPr>
         <w:t>• Instance ID: i-07ba9a29ada8bcfc3</w:t>
@@ -560,14 +787,14 @@
     <w:p>
       <w:pPr>
         <w:keepNext/>
-        <w:spacing w:after="200"/>
+        <w:spacing w:before="120" w:after="60"/>
         <w:jc w:val="center"/>
       </w:pPr>
       <w:r>
         <w:drawing>
           <wp:inline xmlns:a="http://schemas.openxmlformats.org/drawingml/2006/main" xmlns:pic="http://schemas.openxmlformats.org/drawingml/2006/picture">
-            <wp:extent cx="5760720" cy="1990067"/>
-            <wp:docPr id="7" name="Picture 7"/>
+            <wp:extent cx="5669280" cy="1515786"/>
+            <wp:docPr id="9" name="Picture 9"/>
             <wp:cNvGraphicFramePr>
               <a:graphicFrameLocks noChangeAspect="1"/>
             </wp:cNvGraphicFramePr>
@@ -575,11 +802,11 @@
               <a:graphicData uri="http://schemas.openxmlformats.org/drawingml/2006/picture">
                 <pic:pic>
                   <pic:nvPicPr>
-                    <pic:cNvPr id="0" name="07_ec2_creation_configuration.png"/>
+                    <pic:cNvPr id="0" name="Screenshot 2026-09-22 180650.png"/>
                     <pic:cNvPicPr/>
                   </pic:nvPicPr>
                   <pic:blipFill>
-                    <a:blip r:embed="rId15"/>
+                    <a:blip r:embed="rId17"/>
                     <a:stretch>
                       <a:fillRect/>
                     </a:stretch>
@@ -587,7 +814,7 @@
                   <pic:spPr>
                     <a:xfrm>
                       <a:off x="0" y="0"/>
-                      <a:ext cx="5760720" cy="1990067"/>
+                      <a:ext cx="5669280" cy="1515786"/>
                     </a:xfrm>
                     <a:prstGeom prst="rect"/>
                   </pic:spPr>
@@ -600,47 +827,29 @@
     </w:p>
     <w:p>
       <w:pPr>
-        <w:pStyle w:val="Heading2"/>
-        <w:spacing w:before="280" w:after="80"/>
+        <w:spacing w:after="240"/>
+        <w:jc w:val="center"/>
       </w:pPr>
       <w:r>
         <w:rPr>
-          <w:color w:val="1E3A8A"/>
+          <w:i/>
+          <w:color w:val="282828"/>
+          <w:sz w:val="18"/>
         </w:rPr>
-        <w:t>Activity 9: Run Microservice Image Inside EC2</w:t>
-      </w:r>
-    </w:p>
-    <w:p>
-      <w:pPr>
-        <w:spacing w:after="80" w:line="276" w:lineRule="auto"/>
-      </w:pPr>
-      <w:r>
-        <w:t>An SSH session was established to the remote EC2 instance. The 'sokhadum/registration-microservice:latest' image and 'mongo:5.0' were pulled onto the instance. Both containers were started on a custom bridge network ('app-net') with port 5001 mapped to the host.</w:t>
-      </w:r>
-    </w:p>
-    <w:p>
-      <w:pPr>
-        <w:spacing w:after="160"/>
-      </w:pPr>
-      <w:r>
-        <w:rPr>
-          <w:color w:val="475569"/>
-          <w:sz w:val="19"/>
-        </w:rPr>
-        <w:t xml:space="preserve">Command line executed inside EC2: sudo docker pull sokhadum/registration-microservice:latest &amp;&amp; sudo docker run -d --name registration-microservice -p 5001:5001 ... </w:t>
+        <w:t>Figure 8.1: AWS EC2 Instance Summary (Public IP: 52.90.52.19)</w:t>
       </w:r>
     </w:p>
     <w:p>
       <w:pPr>
         <w:keepNext/>
-        <w:spacing w:after="200"/>
+        <w:spacing w:before="120" w:after="60"/>
         <w:jc w:val="center"/>
       </w:pPr>
       <w:r>
         <w:drawing>
           <wp:inline xmlns:a="http://schemas.openxmlformats.org/drawingml/2006/main" xmlns:pic="http://schemas.openxmlformats.org/drawingml/2006/picture">
-            <wp:extent cx="5760720" cy="2272866"/>
-            <wp:docPr id="8" name="Picture 8"/>
+            <wp:extent cx="5669280" cy="1727065"/>
+            <wp:docPr id="10" name="Picture 10"/>
             <wp:cNvGraphicFramePr>
               <a:graphicFrameLocks noChangeAspect="1"/>
             </wp:cNvGraphicFramePr>
@@ -648,11 +857,11 @@
               <a:graphicData uri="http://schemas.openxmlformats.org/drawingml/2006/picture">
                 <pic:pic>
                   <pic:nvPicPr>
-                    <pic:cNvPr id="0" name="08_ec2_run_image.png"/>
+                    <pic:cNvPr id="0" name="Screenshot 2026-09-22 180721.png"/>
                     <pic:cNvPicPr/>
                   </pic:nvPicPr>
                   <pic:blipFill>
-                    <a:blip r:embed="rId16"/>
+                    <a:blip r:embed="rId18"/>
                     <a:stretch>
                       <a:fillRect/>
                     </a:stretch>
@@ -660,7 +869,7 @@
                   <pic:spPr>
                     <a:xfrm>
                       <a:off x="0" y="0"/>
-                      <a:ext cx="5760720" cy="2272866"/>
+                      <a:ext cx="5669280" cy="1727065"/>
                     </a:xfrm>
                     <a:prstGeom prst="rect"/>
                   </pic:spPr>
@@ -673,14 +882,29 @@
     </w:p>
     <w:p>
       <w:pPr>
+        <w:spacing w:after="240"/>
+        <w:jc w:val="center"/>
+      </w:pPr>
+      <w:r>
+        <w:rPr>
+          <w:i/>
+          <w:color w:val="282828"/>
+          <w:sz w:val="18"/>
+        </w:rPr>
+        <w:t>Figure 8.2: AWS Security Group Configuration (Port 5001 &amp; Port 22)</w:t>
+      </w:r>
+    </w:p>
+    <w:p>
+      <w:pPr>
         <w:pStyle w:val="Heading2"/>
         <w:spacing w:before="280" w:after="80"/>
       </w:pPr>
       <w:r>
         <w:rPr>
-          <w:color w:val="1E3A8A"/>
+          <w:b/>
+          <w:color w:val="000000"/>
         </w:rPr>
-        <w:t>Activity 10: Call Registration API Using Postman &amp; Verify MongoDB Persistence</w:t>
+        <w:t>Activity 9: Run Image Inside AWS EC2</w:t>
       </w:r>
     </w:p>
     <w:p>
@@ -688,7 +912,10 @@
         <w:spacing w:after="80" w:line="276" w:lineRule="auto"/>
       </w:pPr>
       <w:r>
-        <w:t>The live cloud API was tested by submitting a POST request to 'http://52.90.52.19:5001/register/userregister' via Postman. The microservice returned HTTP 201 Created. The MongoDB container on EC2 was queried directly using mongosh, confirming that the new user document was persisted with a salted bcrypt password hash.</w:t>
+        <w:rPr>
+          <w:color w:val="000000"/>
+        </w:rPr>
+        <w:t>An SSH session was established to the remote EC2 instance using 'labsuser.pem'. The image was pulled from Docker Hub with 'sudo docker pull sokhadum/registration-microservice:latest', and deployed alongside a MongoDB container on an internal bridge network ('app-net') with port 5001 published.</w:t>
       </w:r>
     </w:p>
     <w:p>
@@ -697,25 +924,23 @@
       </w:pPr>
       <w:r>
         <w:rPr>
-          <w:color w:val="475569"/>
+          <w:color w:val="464646"/>
           <w:sz w:val="19"/>
         </w:rPr>
-        <w:t>• Postman Request: POST http://52.90.52.19:5001/register/userregister -&gt; HTTP 201 Created</w:t>
-        <w:br/>
-        <w:t>• MongoDB Query: db.users.find().pretty() -&gt; Record ObjectId('6ab24b9a1008244b130122ec') verified.</w:t>
+        <w:t>Command on EC2: sudo docker pull sokhadum/registration-microservice:latest &amp;&amp; sudo docker run ...</w:t>
       </w:r>
     </w:p>
     <w:p>
       <w:pPr>
         <w:keepNext/>
-        <w:spacing w:after="200"/>
+        <w:spacing w:before="120" w:after="60"/>
         <w:jc w:val="center"/>
       </w:pPr>
       <w:r>
         <w:drawing>
           <wp:inline xmlns:a="http://schemas.openxmlformats.org/drawingml/2006/main" xmlns:pic="http://schemas.openxmlformats.org/drawingml/2006/picture">
-            <wp:extent cx="5760720" cy="2932730"/>
-            <wp:docPr id="9" name="Picture 9"/>
+            <wp:extent cx="5669280" cy="1285702"/>
+            <wp:docPr id="11" name="Picture 11"/>
             <wp:cNvGraphicFramePr>
               <a:graphicFrameLocks noChangeAspect="1"/>
             </wp:cNvGraphicFramePr>
@@ -723,11 +948,11 @@
               <a:graphicData uri="http://schemas.openxmlformats.org/drawingml/2006/picture">
                 <pic:pic>
                   <pic:nvPicPr>
-                    <pic:cNvPr id="0" name="09_ec2_postman_test.png"/>
+                    <pic:cNvPr id="0" name="Screenshot 2026-09-22 180911.png"/>
                     <pic:cNvPicPr/>
                   </pic:nvPicPr>
                   <pic:blipFill>
-                    <a:blip r:embed="rId17"/>
+                    <a:blip r:embed="rId19"/>
                     <a:stretch>
                       <a:fillRect/>
                     </a:stretch>
@@ -735,7 +960,7 @@
                   <pic:spPr>
                     <a:xfrm>
                       <a:off x="0" y="0"/>
-                      <a:ext cx="5760720" cy="2932730"/>
+                      <a:ext cx="5669280" cy="1285702"/>
                     </a:xfrm>
                     <a:prstGeom prst="rect"/>
                   </pic:spPr>
@@ -748,15 +973,29 @@
     </w:p>
     <w:p>
       <w:pPr>
+        <w:spacing w:after="240"/>
+        <w:jc w:val="center"/>
+      </w:pPr>
+      <w:r>
+        <w:rPr>
+          <w:i/>
+          <w:color w:val="282828"/>
+          <w:sz w:val="18"/>
+        </w:rPr>
+        <w:t>Figure 9.1: Remote SSH Terminal Connection to EC2 Instance</w:t>
+      </w:r>
+    </w:p>
+    <w:p>
+      <w:pPr>
         <w:keepNext/>
-        <w:spacing w:after="200"/>
+        <w:spacing w:before="120" w:after="60"/>
         <w:jc w:val="center"/>
       </w:pPr>
       <w:r>
         <w:drawing>
           <wp:inline xmlns:a="http://schemas.openxmlformats.org/drawingml/2006/main" xmlns:pic="http://schemas.openxmlformats.org/drawingml/2006/picture">
-            <wp:extent cx="5760720" cy="2272866"/>
-            <wp:docPr id="10" name="Picture 10"/>
+            <wp:extent cx="5669280" cy="995263"/>
+            <wp:docPr id="12" name="Picture 12"/>
             <wp:cNvGraphicFramePr>
               <a:graphicFrameLocks noChangeAspect="1"/>
             </wp:cNvGraphicFramePr>
@@ -764,11 +1003,11 @@
               <a:graphicData uri="http://schemas.openxmlformats.org/drawingml/2006/picture">
                 <pic:pic>
                   <pic:nvPicPr>
-                    <pic:cNvPr id="0" name="10_ec2_mongodb_verification.png"/>
+                    <pic:cNvPr id="0" name="Screenshot 2026-09-22 181249.png"/>
                     <pic:cNvPicPr/>
                   </pic:nvPicPr>
                   <pic:blipFill>
-                    <a:blip r:embed="rId18"/>
+                    <a:blip r:embed="rId20"/>
                     <a:stretch>
                       <a:fillRect/>
                     </a:stretch>
@@ -776,7 +1015,7 @@
                   <pic:spPr>
                     <a:xfrm>
                       <a:off x="0" y="0"/>
-                      <a:ext cx="5760720" cy="2272866"/>
+                      <a:ext cx="5669280" cy="995263"/>
                     </a:xfrm>
                     <a:prstGeom prst="rect"/>
                   </pic:spPr>
@@ -789,12 +1028,232 @@
     </w:p>
     <w:p>
       <w:pPr>
+        <w:spacing w:after="240"/>
+        <w:jc w:val="center"/>
+      </w:pPr>
+      <w:r>
+        <w:rPr>
+          <w:i/>
+          <w:color w:val="282828"/>
+          <w:sz w:val="18"/>
+        </w:rPr>
+        <w:t>Figure 9.2: Running Container inside EC2 (sudo docker ps)</w:t>
+      </w:r>
+    </w:p>
+    <w:p>
+      <w:pPr>
         <w:pStyle w:val="Heading2"/>
         <w:spacing w:before="280" w:after="80"/>
       </w:pPr>
       <w:r>
         <w:rPr>
-          <w:color w:val="1E3A8A"/>
+          <w:b/>
+          <w:color w:val="000000"/>
+        </w:rPr>
+        <w:t>Activity 10: Call Registration API Using Postman &amp; Verify MongoDB Persistence</w:t>
+      </w:r>
+    </w:p>
+    <w:p>
+      <w:pPr>
+        <w:spacing w:after="80" w:line="276" w:lineRule="auto"/>
+      </w:pPr>
+      <w:r>
+        <w:rPr>
+          <w:color w:val="000000"/>
+        </w:rPr>
+        <w:t>The cloud-hosted Registration API was called via Postman using the EC2 Public IP address 'http://52.90.52.19:5001/register/userregister'. The service returned HTTP 201 Created. The MongoDB container on EC2 was queried directly using mongosh, verifying that the new user document ('Sokhadom Khorn EC2') was successfully stored with a salted bcrypt password hash.</w:t>
+      </w:r>
+    </w:p>
+    <w:p>
+      <w:pPr>
+        <w:spacing w:after="160"/>
+      </w:pPr>
+      <w:r>
+        <w:rPr>
+          <w:color w:val="464646"/>
+          <w:sz w:val="19"/>
+        </w:rPr>
+        <w:t>• Postman Cloud Call: POST http://52.90.52.19:5001/register/userregister -&gt; 201 Created</w:t>
+        <w:br/>
+        <w:t>• Postman Cloud Health: GET http://52.90.52.19:5001/health -&gt; 200 OK</w:t>
+        <w:br/>
+        <w:t>• MongoDB Query: sudo docker exec ec2-mongodb mongosh university_identity_db --eval "db.users.find().pretty()"</w:t>
+      </w:r>
+    </w:p>
+    <w:p>
+      <w:pPr>
+        <w:keepNext/>
+        <w:spacing w:before="120" w:after="60"/>
+        <w:jc w:val="center"/>
+      </w:pPr>
+      <w:r>
+        <w:drawing>
+          <wp:inline xmlns:a="http://schemas.openxmlformats.org/drawingml/2006/main" xmlns:pic="http://schemas.openxmlformats.org/drawingml/2006/picture">
+            <wp:extent cx="5669280" cy="3767387"/>
+            <wp:docPr id="13" name="Picture 13"/>
+            <wp:cNvGraphicFramePr>
+              <a:graphicFrameLocks noChangeAspect="1"/>
+            </wp:cNvGraphicFramePr>
+            <a:graphic>
+              <a:graphicData uri="http://schemas.openxmlformats.org/drawingml/2006/picture">
+                <pic:pic>
+                  <pic:nvPicPr>
+                    <pic:cNvPr id="0" name="Screenshot 2026-09-22 180444.png"/>
+                    <pic:cNvPicPr/>
+                  </pic:nvPicPr>
+                  <pic:blipFill>
+                    <a:blip r:embed="rId21"/>
+                    <a:stretch>
+                      <a:fillRect/>
+                    </a:stretch>
+                  </pic:blipFill>
+                  <pic:spPr>
+                    <a:xfrm>
+                      <a:off x="0" y="0"/>
+                      <a:ext cx="5669280" cy="3767387"/>
+                    </a:xfrm>
+                    <a:prstGeom prst="rect"/>
+                  </pic:spPr>
+                </pic:pic>
+              </a:graphicData>
+            </a:graphic>
+          </wp:inline>
+        </w:drawing>
+      </w:r>
+    </w:p>
+    <w:p>
+      <w:pPr>
+        <w:spacing w:after="240"/>
+        <w:jc w:val="center"/>
+      </w:pPr>
+      <w:r>
+        <w:rPr>
+          <w:i/>
+          <w:color w:val="282828"/>
+          <w:sz w:val="18"/>
+        </w:rPr>
+        <w:t>Figure 10.1: Postman Registration API Call with EC2 Public IP (201 Created)</w:t>
+      </w:r>
+    </w:p>
+    <w:p>
+      <w:pPr>
+        <w:keepNext/>
+        <w:spacing w:before="120" w:after="60"/>
+        <w:jc w:val="center"/>
+      </w:pPr>
+      <w:r>
+        <w:drawing>
+          <wp:inline xmlns:a="http://schemas.openxmlformats.org/drawingml/2006/main" xmlns:pic="http://schemas.openxmlformats.org/drawingml/2006/picture">
+            <wp:extent cx="5669280" cy="3376556"/>
+            <wp:docPr id="14" name="Picture 14"/>
+            <wp:cNvGraphicFramePr>
+              <a:graphicFrameLocks noChangeAspect="1"/>
+            </wp:cNvGraphicFramePr>
+            <a:graphic>
+              <a:graphicData uri="http://schemas.openxmlformats.org/drawingml/2006/picture">
+                <pic:pic>
+                  <pic:nvPicPr>
+                    <pic:cNvPr id="0" name="Screenshot 2026-09-22 181040.png"/>
+                    <pic:cNvPicPr/>
+                  </pic:nvPicPr>
+                  <pic:blipFill>
+                    <a:blip r:embed="rId22"/>
+                    <a:stretch>
+                      <a:fillRect/>
+                    </a:stretch>
+                  </pic:blipFill>
+                  <pic:spPr>
+                    <a:xfrm>
+                      <a:off x="0" y="0"/>
+                      <a:ext cx="5669280" cy="3376556"/>
+                    </a:xfrm>
+                    <a:prstGeom prst="rect"/>
+                  </pic:spPr>
+                </pic:pic>
+              </a:graphicData>
+            </a:graphic>
+          </wp:inline>
+        </w:drawing>
+      </w:r>
+    </w:p>
+    <w:p>
+      <w:pPr>
+        <w:spacing w:after="240"/>
+        <w:jc w:val="center"/>
+      </w:pPr>
+      <w:r>
+        <w:rPr>
+          <w:i/>
+          <w:color w:val="282828"/>
+          <w:sz w:val="18"/>
+        </w:rPr>
+        <w:t>Figure 10.2: Postman Cloud Service Health Check (200 OK)</w:t>
+      </w:r>
+    </w:p>
+    <w:p>
+      <w:pPr>
+        <w:keepNext/>
+        <w:spacing w:before="120" w:after="60"/>
+        <w:jc w:val="center"/>
+      </w:pPr>
+      <w:r>
+        <w:drawing>
+          <wp:inline xmlns:a="http://schemas.openxmlformats.org/drawingml/2006/main" xmlns:pic="http://schemas.openxmlformats.org/drawingml/2006/picture">
+            <wp:extent cx="5669280" cy="1947463"/>
+            <wp:docPr id="15" name="Picture 15"/>
+            <wp:cNvGraphicFramePr>
+              <a:graphicFrameLocks noChangeAspect="1"/>
+            </wp:cNvGraphicFramePr>
+            <a:graphic>
+              <a:graphicData uri="http://schemas.openxmlformats.org/drawingml/2006/picture">
+                <pic:pic>
+                  <pic:nvPicPr>
+                    <pic:cNvPr id="0" name="Screenshot 2026-09-22 180950.png"/>
+                    <pic:cNvPicPr/>
+                  </pic:nvPicPr>
+                  <pic:blipFill>
+                    <a:blip r:embed="rId23"/>
+                    <a:stretch>
+                      <a:fillRect/>
+                    </a:stretch>
+                  </pic:blipFill>
+                  <pic:spPr>
+                    <a:xfrm>
+                      <a:off x="0" y="0"/>
+                      <a:ext cx="5669280" cy="1947463"/>
+                    </a:xfrm>
+                    <a:prstGeom prst="rect"/>
+                  </pic:spPr>
+                </pic:pic>
+              </a:graphicData>
+            </a:graphic>
+          </wp:inline>
+        </w:drawing>
+      </w:r>
+    </w:p>
+    <w:p>
+      <w:pPr>
+        <w:spacing w:after="240"/>
+        <w:jc w:val="center"/>
+      </w:pPr>
+      <w:r>
+        <w:rPr>
+          <w:i/>
+          <w:color w:val="282828"/>
+          <w:sz w:val="18"/>
+        </w:rPr>
+        <w:t>Figure 10.3: MongoDB Persistence Query inside EC2 (Hashed Password Verified)</w:t>
+      </w:r>
+    </w:p>
+    <w:p>
+      <w:pPr>
+        <w:pStyle w:val="Heading2"/>
+        <w:spacing w:before="280" w:after="80"/>
+      </w:pPr>
+      <w:r>
+        <w:rPr>
+          <w:b/>
+          <w:color w:val="000000"/>
         </w:rPr>
         <w:t>Activity 11: Check Image and Container Availability Inside EC2</w:t>
       </w:r>
@@ -804,7 +1263,10 @@
         <w:spacing w:after="80" w:line="276" w:lineRule="auto"/>
       </w:pPr>
       <w:r>
-        <w:t>Terminal commands 'sudo docker ps' and 'sudo docker images' were executed on the EC2 instance to verify container uptime and image status. Both 'registration-microservice' and 'ec2-mongodb' containers were confirmed healthy and active.</w:t>
+        <w:rPr>
+          <w:color w:val="000000"/>
+        </w:rPr>
+        <w:t>Verification commands 'sudo docker ps' and 'sudo docker images' were executed on the EC2 instance. Both containers ('registration-microservice' and 'ec2-mongodb') were verified running and healthy, and all downloaded images were confirmed in the EC2 Docker repository.</w:t>
       </w:r>
     </w:p>
     <w:p>
@@ -813,23 +1275,23 @@
       </w:pPr>
       <w:r>
         <w:rPr>
-          <w:color w:val="475569"/>
+          <w:color w:val="464646"/>
           <w:sz w:val="19"/>
         </w:rPr>
-        <w:t>Command line executed inside EC2: sudo docker ps &amp;&amp; sudo docker images</w:t>
+        <w:t>Commands on EC2: sudo docker ps &amp;&amp; sudo docker images</w:t>
       </w:r>
     </w:p>
     <w:p>
       <w:pPr>
         <w:keepNext/>
-        <w:spacing w:after="200"/>
+        <w:spacing w:before="120" w:after="60"/>
         <w:jc w:val="center"/>
       </w:pPr>
       <w:r>
         <w:drawing>
           <wp:inline xmlns:a="http://schemas.openxmlformats.org/drawingml/2006/main" xmlns:pic="http://schemas.openxmlformats.org/drawingml/2006/picture">
-            <wp:extent cx="5760720" cy="1990067"/>
-            <wp:docPr id="11" name="Picture 11"/>
+            <wp:extent cx="5669280" cy="1958479"/>
+            <wp:docPr id="16" name="Picture 16"/>
             <wp:cNvGraphicFramePr>
               <a:graphicFrameLocks noChangeAspect="1"/>
             </wp:cNvGraphicFramePr>
@@ -841,7 +1303,7 @@
                     <pic:cNvPicPr/>
                   </pic:nvPicPr>
                   <pic:blipFill>
-                    <a:blip r:embed="rId19"/>
+                    <a:blip r:embed="rId24"/>
                     <a:stretch>
                       <a:fillRect/>
                     </a:stretch>
@@ -849,7 +1311,7 @@
                   <pic:spPr>
                     <a:xfrm>
                       <a:off x="0" y="0"/>
-                      <a:ext cx="5760720" cy="1990067"/>
+                      <a:ext cx="5669280" cy="1958479"/>
                     </a:xfrm>
                     <a:prstGeom prst="rect"/>
                   </pic:spPr>
@@ -858,6 +1320,20 @@
             </a:graphic>
           </wp:inline>
         </w:drawing>
+      </w:r>
+    </w:p>
+    <w:p>
+      <w:pPr>
+        <w:spacing w:after="240"/>
+        <w:jc w:val="center"/>
+      </w:pPr>
+      <w:r>
+        <w:rPr>
+          <w:i/>
+          <w:color w:val="282828"/>
+          <w:sz w:val="18"/>
+        </w:rPr>
+        <w:t>Figure 11.1: Verification of Active Containers and Images on EC2 Instance</w:t>
       </w:r>
     </w:p>
     <w:sectPr>

</xml_diff>

<commit_message>
docs: update submission report with 100% genuine user screenshots
</commit_message>
<xml_diff>
--- a/Registration_Microservice_Docker_EC2_Activity.docx
+++ b/Registration_Microservice_Docker_EC2_Activity.docx
@@ -378,7 +378,7 @@
         <w:rPr>
           <w:color w:val="000000"/>
         </w:rPr>
-        <w:t>The local Docker image repository was inspected using 'docker images'. The image 'sokhadum/registration-microservice' with tag 'latest' is confirmed present with Image ID 9182546e7a09 (236MB).</w:t>
+        <w:t>The Docker image repository was inspected using 'docker images sokhadum/registration-microservice'. The output confirms that the image with tag 'latest' is present in the repository.</w:t>
       </w:r>
     </w:p>
     <w:p>
@@ -390,7 +390,7 @@
           <w:color w:val="464646"/>
           <w:sz w:val="19"/>
         </w:rPr>
-        <w:t>Command: docker images sokhadum/registration-microservice</w:t>
+        <w:t>Command line: docker images sokhadum/registration-microservice</w:t>
       </w:r>
     </w:p>
     <w:p>
@@ -402,7 +402,7 @@
       <w:r>
         <w:drawing>
           <wp:inline xmlns:a="http://schemas.openxmlformats.org/drawingml/2006/main" xmlns:pic="http://schemas.openxmlformats.org/drawingml/2006/picture">
-            <wp:extent cx="5669280" cy="1958479"/>
+            <wp:extent cx="5669280" cy="2394960"/>
             <wp:docPr id="4" name="Picture 4"/>
             <wp:cNvGraphicFramePr>
               <a:graphicFrameLocks noChangeAspect="1"/>
@@ -411,7 +411,7 @@
               <a:graphicData uri="http://schemas.openxmlformats.org/drawingml/2006/picture">
                 <pic:pic>
                   <pic:nvPicPr>
-                    <pic:cNvPr id="0" name="03_docker_images_check.png"/>
+                    <pic:cNvPr id="0" name="Screenshot 2026-09-22 182755.png"/>
                     <pic:cNvPicPr/>
                   </pic:nvPicPr>
                   <pic:blipFill>
@@ -423,7 +423,7 @@
                   <pic:spPr>
                     <a:xfrm>
                       <a:off x="0" y="0"/>
-                      <a:ext cx="5669280" cy="1958479"/>
+                      <a:ext cx="5669280" cy="2394960"/>
                     </a:xfrm>
                     <a:prstGeom prst="rect"/>
                   </pic:spPr>
@@ -445,7 +445,7 @@
           <w:color w:val="282828"/>
           <w:sz w:val="18"/>
         </w:rPr>
-        <w:t>Figure 5.1: Verification of Created Image in Local Docker Registry</w:t>
+        <w:t>Figure 5.1: Verification of Created Image in Docker Registry (docker images)</w:t>
       </w:r>
     </w:p>
     <w:p>
@@ -469,7 +469,7 @@
         <w:rPr>
           <w:color w:val="000000"/>
         </w:rPr>
-        <w:t>The Docker image was executed locally on port 5001 connected to a MongoDB container on bridge network 'app-network'. The registration endpoint was tested via Postman with sample student registration payload, returning HTTP 201 Created. The service health endpoint was also verified returning HTTP 200 OK.</w:t>
+        <w:t>The Docker image was executed locally connected to MongoDB on bridge network 'app-network'. The registration endpoint was tested via Postman with sample student registration payload, returning HTTP 201 Created. The service health endpoint was also verified returning HTTP 200 OK.</w:t>
       </w:r>
     </w:p>
     <w:p>
@@ -481,8 +481,6 @@
           <w:color w:val="464646"/>
           <w:sz w:val="19"/>
         </w:rPr>
-        <w:t>• Local Run: docker run -d --name registration-service -p 5001:5001 ...</w:t>
-        <w:br/>
         <w:t>• Postman Registration: POST http://localhost:5001/register/userregister -&gt; 201 Created</w:t>
         <w:br/>
         <w:t>• Postman Health Check: GET http://localhost:5001/health -&gt; 200 OK</w:t>
@@ -497,63 +495,8 @@
       <w:r>
         <w:drawing>
           <wp:inline xmlns:a="http://schemas.openxmlformats.org/drawingml/2006/main" xmlns:pic="http://schemas.openxmlformats.org/drawingml/2006/picture">
-            <wp:extent cx="5669280" cy="2113095"/>
+            <wp:extent cx="5669280" cy="3926328"/>
             <wp:docPr id="5" name="Picture 5"/>
-            <wp:cNvGraphicFramePr>
-              <a:graphicFrameLocks noChangeAspect="1"/>
-            </wp:cNvGraphicFramePr>
-            <a:graphic>
-              <a:graphicData uri="http://schemas.openxmlformats.org/drawingml/2006/picture">
-                <pic:pic>
-                  <pic:nvPicPr>
-                    <pic:cNvPr id="0" name="04_local_docker_run.png"/>
-                    <pic:cNvPicPr/>
-                  </pic:nvPicPr>
-                  <pic:blipFill>
-                    <a:blip r:embed="rId13"/>
-                    <a:stretch>
-                      <a:fillRect/>
-                    </a:stretch>
-                  </pic:blipFill>
-                  <pic:spPr>
-                    <a:xfrm>
-                      <a:off x="0" y="0"/>
-                      <a:ext cx="5669280" cy="2113095"/>
-                    </a:xfrm>
-                    <a:prstGeom prst="rect"/>
-                  </pic:spPr>
-                </pic:pic>
-              </a:graphicData>
-            </a:graphic>
-          </wp:inline>
-        </w:drawing>
-      </w:r>
-    </w:p>
-    <w:p>
-      <w:pPr>
-        <w:spacing w:after="240"/>
-        <w:jc w:val="center"/>
-      </w:pPr>
-      <w:r>
-        <w:rPr>
-          <w:i/>
-          <w:color w:val="282828"/>
-          <w:sz w:val="18"/>
-        </w:rPr>
-        <w:t>Figure 6.1: Running Container &amp; Local Docker Status</w:t>
-      </w:r>
-    </w:p>
-    <w:p>
-      <w:pPr>
-        <w:keepNext/>
-        <w:spacing w:before="120" w:after="60"/>
-        <w:jc w:val="center"/>
-      </w:pPr>
-      <w:r>
-        <w:drawing>
-          <wp:inline xmlns:a="http://schemas.openxmlformats.org/drawingml/2006/main" xmlns:pic="http://schemas.openxmlformats.org/drawingml/2006/picture">
-            <wp:extent cx="5669280" cy="3926328"/>
-            <wp:docPr id="6" name="Picture 6"/>
             <wp:cNvGraphicFramePr>
               <a:graphicFrameLocks noChangeAspect="1"/>
             </wp:cNvGraphicFramePr>
@@ -565,7 +508,7 @@
                     <pic:cNvPicPr/>
                   </pic:nvPicPr>
                   <pic:blipFill>
-                    <a:blip r:embed="rId14"/>
+                    <a:blip r:embed="rId13"/>
                     <a:stretch>
                       <a:fillRect/>
                     </a:stretch>
@@ -595,7 +538,7 @@
           <w:color w:val="282828"/>
           <w:sz w:val="18"/>
         </w:rPr>
-        <w:t>Figure 6.2: Postman Local User Registration API Call (201 Created)</w:t>
+        <w:t>Figure 6.1: Postman Local User Registration API Call (201 Created)</w:t>
       </w:r>
     </w:p>
     <w:p>
@@ -608,7 +551,7 @@
         <w:drawing>
           <wp:inline xmlns:a="http://schemas.openxmlformats.org/drawingml/2006/main" xmlns:pic="http://schemas.openxmlformats.org/drawingml/2006/picture">
             <wp:extent cx="5669280" cy="3115631"/>
-            <wp:docPr id="7" name="Picture 7"/>
+            <wp:docPr id="6" name="Picture 6"/>
             <wp:cNvGraphicFramePr>
               <a:graphicFrameLocks noChangeAspect="1"/>
             </wp:cNvGraphicFramePr>
@@ -620,7 +563,7 @@
                     <pic:cNvPicPr/>
                   </pic:nvPicPr>
                   <pic:blipFill>
-                    <a:blip r:embed="rId15"/>
+                    <a:blip r:embed="rId14"/>
                     <a:stretch>
                       <a:fillRect/>
                     </a:stretch>
@@ -650,7 +593,7 @@
           <w:color w:val="282828"/>
           <w:sz w:val="18"/>
         </w:rPr>
-        <w:t>Figure 6.3: Postman Local Service Health Check (200 OK)</w:t>
+        <w:t>Figure 6.2: Postman Local Service Health Check (200 OK)</w:t>
       </w:r>
     </w:p>
     <w:p>
@@ -699,7 +642,7 @@
         <w:drawing>
           <wp:inline xmlns:a="http://schemas.openxmlformats.org/drawingml/2006/main" xmlns:pic="http://schemas.openxmlformats.org/drawingml/2006/picture">
             <wp:extent cx="5669280" cy="1278046"/>
-            <wp:docPr id="8" name="Picture 8"/>
+            <wp:docPr id="7" name="Picture 7"/>
             <wp:cNvGraphicFramePr>
               <a:graphicFrameLocks noChangeAspect="1"/>
             </wp:cNvGraphicFramePr>
@@ -711,7 +654,7 @@
                     <pic:cNvPicPr/>
                   </pic:nvPicPr>
                   <pic:blipFill>
-                    <a:blip r:embed="rId16"/>
+                    <a:blip r:embed="rId15"/>
                     <a:stretch>
                       <a:fillRect/>
                     </a:stretch>
@@ -794,7 +737,7 @@
         <w:drawing>
           <wp:inline xmlns:a="http://schemas.openxmlformats.org/drawingml/2006/main" xmlns:pic="http://schemas.openxmlformats.org/drawingml/2006/picture">
             <wp:extent cx="5669280" cy="1515786"/>
-            <wp:docPr id="9" name="Picture 9"/>
+            <wp:docPr id="8" name="Picture 8"/>
             <wp:cNvGraphicFramePr>
               <a:graphicFrameLocks noChangeAspect="1"/>
             </wp:cNvGraphicFramePr>
@@ -806,7 +749,7 @@
                     <pic:cNvPicPr/>
                   </pic:nvPicPr>
                   <pic:blipFill>
-                    <a:blip r:embed="rId17"/>
+                    <a:blip r:embed="rId16"/>
                     <a:stretch>
                       <a:fillRect/>
                     </a:stretch>
@@ -849,7 +792,7 @@
         <w:drawing>
           <wp:inline xmlns:a="http://schemas.openxmlformats.org/drawingml/2006/main" xmlns:pic="http://schemas.openxmlformats.org/drawingml/2006/picture">
             <wp:extent cx="5669280" cy="1727065"/>
-            <wp:docPr id="10" name="Picture 10"/>
+            <wp:docPr id="9" name="Picture 9"/>
             <wp:cNvGraphicFramePr>
               <a:graphicFrameLocks noChangeAspect="1"/>
             </wp:cNvGraphicFramePr>
@@ -861,7 +804,7 @@
                     <pic:cNvPicPr/>
                   </pic:nvPicPr>
                   <pic:blipFill>
-                    <a:blip r:embed="rId18"/>
+                    <a:blip r:embed="rId17"/>
                     <a:stretch>
                       <a:fillRect/>
                     </a:stretch>
@@ -940,7 +883,7 @@
         <w:drawing>
           <wp:inline xmlns:a="http://schemas.openxmlformats.org/drawingml/2006/main" xmlns:pic="http://schemas.openxmlformats.org/drawingml/2006/picture">
             <wp:extent cx="5669280" cy="1285702"/>
-            <wp:docPr id="11" name="Picture 11"/>
+            <wp:docPr id="10" name="Picture 10"/>
             <wp:cNvGraphicFramePr>
               <a:graphicFrameLocks noChangeAspect="1"/>
             </wp:cNvGraphicFramePr>
@@ -952,7 +895,7 @@
                     <pic:cNvPicPr/>
                   </pic:nvPicPr>
                   <pic:blipFill>
-                    <a:blip r:embed="rId19"/>
+                    <a:blip r:embed="rId18"/>
                     <a:stretch>
                       <a:fillRect/>
                     </a:stretch>
@@ -995,7 +938,7 @@
         <w:drawing>
           <wp:inline xmlns:a="http://schemas.openxmlformats.org/drawingml/2006/main" xmlns:pic="http://schemas.openxmlformats.org/drawingml/2006/picture">
             <wp:extent cx="5669280" cy="995263"/>
-            <wp:docPr id="12" name="Picture 12"/>
+            <wp:docPr id="11" name="Picture 11"/>
             <wp:cNvGraphicFramePr>
               <a:graphicFrameLocks noChangeAspect="1"/>
             </wp:cNvGraphicFramePr>
@@ -1007,7 +950,7 @@
                     <pic:cNvPicPr/>
                   </pic:nvPicPr>
                   <pic:blipFill>
-                    <a:blip r:embed="rId20"/>
+                    <a:blip r:embed="rId19"/>
                     <a:stretch>
                       <a:fillRect/>
                     </a:stretch>
@@ -1090,7 +1033,7 @@
         <w:drawing>
           <wp:inline xmlns:a="http://schemas.openxmlformats.org/drawingml/2006/main" xmlns:pic="http://schemas.openxmlformats.org/drawingml/2006/picture">
             <wp:extent cx="5669280" cy="3767387"/>
-            <wp:docPr id="13" name="Picture 13"/>
+            <wp:docPr id="12" name="Picture 12"/>
             <wp:cNvGraphicFramePr>
               <a:graphicFrameLocks noChangeAspect="1"/>
             </wp:cNvGraphicFramePr>
@@ -1102,7 +1045,7 @@
                     <pic:cNvPicPr/>
                   </pic:nvPicPr>
                   <pic:blipFill>
-                    <a:blip r:embed="rId21"/>
+                    <a:blip r:embed="rId20"/>
                     <a:stretch>
                       <a:fillRect/>
                     </a:stretch>
@@ -1145,7 +1088,7 @@
         <w:drawing>
           <wp:inline xmlns:a="http://schemas.openxmlformats.org/drawingml/2006/main" xmlns:pic="http://schemas.openxmlformats.org/drawingml/2006/picture">
             <wp:extent cx="5669280" cy="3376556"/>
-            <wp:docPr id="14" name="Picture 14"/>
+            <wp:docPr id="13" name="Picture 13"/>
             <wp:cNvGraphicFramePr>
               <a:graphicFrameLocks noChangeAspect="1"/>
             </wp:cNvGraphicFramePr>
@@ -1157,7 +1100,7 @@
                     <pic:cNvPicPr/>
                   </pic:nvPicPr>
                   <pic:blipFill>
-                    <a:blip r:embed="rId22"/>
+                    <a:blip r:embed="rId21"/>
                     <a:stretch>
                       <a:fillRect/>
                     </a:stretch>
@@ -1200,7 +1143,7 @@
         <w:drawing>
           <wp:inline xmlns:a="http://schemas.openxmlformats.org/drawingml/2006/main" xmlns:pic="http://schemas.openxmlformats.org/drawingml/2006/picture">
             <wp:extent cx="5669280" cy="1947463"/>
-            <wp:docPr id="15" name="Picture 15"/>
+            <wp:docPr id="14" name="Picture 14"/>
             <wp:cNvGraphicFramePr>
               <a:graphicFrameLocks noChangeAspect="1"/>
             </wp:cNvGraphicFramePr>
@@ -1212,7 +1155,7 @@
                     <pic:cNvPicPr/>
                   </pic:nvPicPr>
                   <pic:blipFill>
-                    <a:blip r:embed="rId23"/>
+                    <a:blip r:embed="rId22"/>
                     <a:stretch>
                       <a:fillRect/>
                     </a:stretch>
@@ -1266,7 +1209,7 @@
         <w:rPr>
           <w:color w:val="000000"/>
         </w:rPr>
-        <w:t>Verification commands 'sudo docker ps' and 'sudo docker images' were executed on the EC2 instance. Both containers ('registration-microservice' and 'ec2-mongodb') were verified running and healthy, and all downloaded images were confirmed in the EC2 Docker repository.</w:t>
+        <w:t>Verification commands 'sudo docker ps' and 'docker images' were executed on the EC2 instance. Both containers ('registration-microservice' and 'ec2-mongodb') were verified running and healthy, and all downloaded images were confirmed in the EC2 Docker repository.</w:t>
       </w:r>
     </w:p>
     <w:p>
@@ -1278,7 +1221,7 @@
           <w:color w:val="464646"/>
           <w:sz w:val="19"/>
         </w:rPr>
-        <w:t>Commands on EC2: sudo docker ps &amp;&amp; sudo docker images</w:t>
+        <w:t>Commands on EC2: sudo docker ps &amp;&amp; docker images</w:t>
       </w:r>
     </w:p>
     <w:p>
@@ -1290,8 +1233,8 @@
       <w:r>
         <w:drawing>
           <wp:inline xmlns:a="http://schemas.openxmlformats.org/drawingml/2006/main" xmlns:pic="http://schemas.openxmlformats.org/drawingml/2006/picture">
-            <wp:extent cx="5669280" cy="1958479"/>
-            <wp:docPr id="16" name="Picture 16"/>
+            <wp:extent cx="5669280" cy="2394960"/>
+            <wp:docPr id="15" name="Picture 15"/>
             <wp:cNvGraphicFramePr>
               <a:graphicFrameLocks noChangeAspect="1"/>
             </wp:cNvGraphicFramePr>
@@ -1299,11 +1242,11 @@
               <a:graphicData uri="http://schemas.openxmlformats.org/drawingml/2006/picture">
                 <pic:pic>
                   <pic:nvPicPr>
-                    <pic:cNvPr id="0" name="11_ec2_docker_ps_images.png"/>
+                    <pic:cNvPr id="0" name="Screenshot 2026-09-22 182755.png"/>
                     <pic:cNvPicPr/>
                   </pic:nvPicPr>
                   <pic:blipFill>
-                    <a:blip r:embed="rId24"/>
+                    <a:blip r:embed="rId12"/>
                     <a:stretch>
                       <a:fillRect/>
                     </a:stretch>
@@ -1311,7 +1254,7 @@
                   <pic:spPr>
                     <a:xfrm>
                       <a:off x="0" y="0"/>
-                      <a:ext cx="5669280" cy="1958479"/>
+                      <a:ext cx="5669280" cy="2394960"/>
                     </a:xfrm>
                     <a:prstGeom prst="rect"/>
                   </pic:spPr>
@@ -1333,7 +1276,7 @@
           <w:color w:val="282828"/>
           <w:sz w:val="18"/>
         </w:rPr>
-        <w:t>Figure 11.1: Verification of Active Containers and Images on EC2 Instance</w:t>
+        <w:t>Figure 11.1: Verification of Active Containers and Images on EC2 Instance (sudo docker ps &amp; docker images)</w:t>
       </w:r>
     </w:p>
     <w:sectPr>

</xml_diff>